<commit_message>
chore: finalize submission reports, deterministic SHAP and reproducibility records
Remove five superseded logs; preserve analysis outputs and virtual demo boundaries.
Full seven-stage raw-data rerun, 42 artifacts and core checks passed.
Update final team reports, AI disclosure, instructions and submission checklist.
</commit_message>
<xml_diff>
--- a/report/노인공경버스어벤저스_분석보고서.docx
+++ b/report/노인공경버스어벤저스_분석보고서.docx
@@ -1942,7 +1942,7 @@
           <w:sz w:val="18"/>
           <w:szCs w:val="18"/>
         </w:rPr>
-        <w:t xml:space="preserve">으로 세 곳에 썼다. 취약 유형을 데이터에서 찾는 비지도 학습, 그 유형을 검증·설명하는 머신러닝, 운영 조건별 성과를 예측하고 요인을 설명하는 XGBoost 대리모델과 SHAP이다. 코드 작성 보조로 쓴 생성형 AI는 준수사항에 따라 마지막 줄에 밝혔다.</w:t>
+        <w:t xml:space="preserve">으로 세 곳에 썼다. 취약 유형을 데이터에서 찾는 비지도 학습, 그 유형을 검증·설명하는 머신러닝, 운영 조건별 성과를 예측하고 요인을 설명하는 XGBoost 대리모델과 SHAP이다. 코드·문서 작성 보조로 쓴 생성형 AI의 도구와 범위는 아래 표와 마지막 줄에 밝혔다.</w:t>
       </w:r>
     </w:p>
     <w:tbl>
@@ -2915,7 +2915,7 @@
                 <w:sz w:val="15"/>
                 <w:szCs w:val="15"/>
               </w:rPr>
-              <w:t xml:space="preserve">생성형 AI Claude Code (Anthropic)</w:t>
+              <w:t xml:space="preserve">Anthropic Claude Code · OpenAI ChatGPT/Codex</w:t>
             </w:r>
           </w:p>
         </w:tc>
@@ -2950,7 +2950,7 @@
                 <w:sz w:val="15"/>
                 <w:szCs w:val="15"/>
               </w:rPr>
-              <w:t xml:space="preserve">공개데이터 탐색, Python 코드, 보고서 초안 작성 보조</w:t>
+              <w:t xml:space="preserve">공개데이터 탐색, 코드·보고서 초안, 저장소 정리·재실행 검증 보조</w:t>
             </w:r>
           </w:p>
         </w:tc>
@@ -2985,7 +2985,7 @@
                 <w:sz w:val="15"/>
                 <w:szCs w:val="15"/>
               </w:rPr>
-              <w:t xml:space="preserve">재현 검증 완료 (2026.10.13, 제출 전 팀원 최종 확인 필요)</w:t>
+              <w:t xml:space="preserve">자동 재현 검증 완료 (2026.10.14). 제출 전 팀원 최종 확인 필요</w:t>
             </w:r>
           </w:p>
         </w:tc>
@@ -7888,7 +7888,7 @@
           <w:sz w:val="18"/>
           <w:szCs w:val="18"/>
         </w:rPr>
-        <w:t xml:space="preserve"> Python 3.13 (pandas, geopandas, scikit-learn 1.9, SciPy, matplotlib), 난수 시드는 용도별로 고정했다: 군집·부트스트랩·랜덤포레스트·XGBoost 42, 연천 몬테카를로 11·22·33·44·55, 배출계수 불확실성 추출 7, 15개 시군 시나리오 생성 2026. 코드와 재현 방법: https://github.com/hh-s0ll/traffic-data-analysis-contest (analysis/src/run_all.py 한 번으로 모든 표·그림 재현)</w:t>
+        <w:t xml:space="preserve"> Python 3.12.14에서 전체 재실행 검증(pandas, geopandas, scikit-learn 1.9, SciPy, matplotlib). 난수 시드: 군집·부트스트랩·랜덤포레스트·XGBoost·SHAP 점 배치 42, 연천 몬테카를로 11·22·33·44·55, 배출계수 불확실성 7, 시군 시나리오 2026. 코드·재현 방법: https://github.com/hh-s0ll/traffic-data-analysis-contest (analysis/src/run_all.py, 산출물 검사 src/verify_outputs.py, 검증 기록 analysis/validation)</w:t>
       </w:r>
     </w:p>
     <w:p>
@@ -8061,6 +8061,30 @@
           <w:szCs w:val="18"/>
         </w:rPr>
         <w:t xml:space="preserve">본문 그림 1(상대적 취약도 지도), 그림 2(연천군 조건별 탄소 변화), 그림 3(운영 성과 대리모델 SHAP)에 포함했다. 머신러닝 유형화 검증 그림, 최소 합승 인원 곡선, 비지도 학습 유형 지도, 시군별 취약지역 수, 시나리오 데이터셋과 전체 결과표(t1~t22)는 코드 저장소 analysis/output에 있다.</w:t>
+      </w:r>
+    </w:p>
+    <w:p>
+      <w:pPr>
+        <w:spacing w:after="50" w:before="60" w:line="262"/>
+        <w:jc w:val="both"/>
+      </w:pPr>
+      <w:r>
+        <w:rPr>
+          <w:rFonts w:ascii="맑은 고딕" w:cs="맑은 고딕" w:eastAsia="맑은 고딕" w:hAnsi="맑은 고딕"/>
+          <w:b/>
+          <w:bCs/>
+          <w:sz w:val="16"/>
+          <w:szCs w:val="16"/>
+        </w:rPr>
+        <w:t xml:space="preserve">생성형 AI 활용 고지.</w:t>
+      </w:r>
+      <w:r>
+        <w:rPr>
+          <w:rFonts w:ascii="맑은 고딕" w:cs="맑은 고딕" w:eastAsia="맑은 고딕" w:hAnsi="맑은 고딕"/>
+          <w:sz w:val="16"/>
+          <w:szCs w:val="16"/>
+        </w:rPr>
+        <w:t xml:space="preserve"> Anthropic Claude Code와 OpenAI ChatGPT/Codex를 공개데이터 탐색, 코드·문서 초안 작성, 검토·재실행 및 저장소 정리에 활용했다. 실제 분석 수치는 실행 산출물과 대조했으며, 최종 가정·정책 해석과 제출 책임은 팀원에게 있다.</w:t>
       </w:r>
     </w:p>
     <w:sectPr>

</xml_diff>